<commit_message>
Embed SCADA Lite architecture diagram into Solution Architecture section
Insert rendered architecture diagram from SCADA Lite.pptx Slide 1 as an
inline image under the Solution Architecture heading, with a figure caption.

https://claude.ai/code/session_017vscFt44axJyw8N6Z6B9Vj
</commit_message>
<xml_diff>
--- a/R4_CustomerName_Location_ProjectTitle_OfferNo_Technical Offer_Revision.docx
+++ b/R4_CustomerName_Location_ProjectTitle_OfferNo_Technical Offer_Revision.docx
@@ -6760,6 +6760,57 @@
       </w:r>
       <w:bookmarkEnd w:id="15"/>
       <w:bookmarkEnd w:id="16"/>
+    </w:p>
+    <w:p>
+      <w:pPr>
+        <w:jc w:val="center"/>
+      </w:pPr>
+      <w:r>
+        <w:drawing>
+          <wp:inline xmlns:a="http://schemas.openxmlformats.org/drawingml/2006/main" xmlns:pic="http://schemas.openxmlformats.org/drawingml/2006/picture">
+            <wp:extent cx="5486400" cy="3168202"/>
+            <wp:docPr id="2012644941" name="Picture 2012644941"/>
+            <wp:cNvGraphicFramePr>
+              <a:graphicFrameLocks noChangeAspect="1"/>
+            </wp:cNvGraphicFramePr>
+            <a:graphic>
+              <a:graphicData uri="http://schemas.openxmlformats.org/drawingml/2006/picture">
+                <pic:pic>
+                  <pic:nvPicPr>
+                    <pic:cNvPr id="0" name="architecture_diagram.png"/>
+                    <pic:cNvPicPr/>
+                  </pic:nvPicPr>
+                  <pic:blipFill>
+                    <a:blip r:embed="rId24"/>
+                    <a:stretch>
+                      <a:fillRect/>
+                    </a:stretch>
+                  </pic:blipFill>
+                  <pic:spPr>
+                    <a:xfrm>
+                      <a:off x="0" y="0"/>
+                      <a:ext cx="5486400" cy="3168202"/>
+                    </a:xfrm>
+                    <a:prstGeom prst="rect"/>
+                  </pic:spPr>
+                </pic:pic>
+              </a:graphicData>
+            </a:graphic>
+          </wp:inline>
+        </w:drawing>
+      </w:r>
+    </w:p>
+    <w:p>
+      <w:pPr>
+        <w:jc w:val="center"/>
+      </w:pPr>
+      <w:r>
+        <w:rPr>
+          <w:i/>
+          <w:sz w:val="18"/>
+        </w:rPr>
+        <w:t>Figure 1: SCADA Lite – Solution Architecture (Source: SCADA Lite.pptx, Slide 1)</w:t>
+      </w:r>
     </w:p>
     <w:p>
       <w:r>

</xml_diff>

<commit_message>
Update Functional Overview to proposal/offer tone
Rewrite section 3.2 to reflect that SCIL will develop the application
based on agreed requirements — replacing descriptive present-tense language
with forward-looking proposal language (will develop, will deliver, subject
to FDS sign-off, separate service order for Phase 2).

https://claude.ai/code/session_017vscFt44axJyw8N6Z6B9Vj
</commit_message>
<xml_diff>
--- a/R4_CustomerName_Location_ProjectTitle_OfferNo_Technical Offer_Revision.docx
+++ b/R4_CustomerName_Location_ProjectTitle_OfferNo_Technical Offer_Revision.docx
@@ -6617,7 +6617,7 @@
     </w:p>
     <w:p>
       <w:r>
-        <w:t>SCADA Lite is a lightweight, web-based application developed by Smart Controls India Limited (SCIL) for Zeppelin Systems GmbH, Kassel. It is designed to replicate and extend the functionality of the current ZSD (Kassel) PVS application for rubber mixer data logging and display.</w:t>
+        <w:t>Smart Controls India Limited (SCIL) proposes to develop a lightweight, web-based application — SCADA Lite — for Zeppelin Systems GmbH, Kassel, based on the mutually agreed requirements. The application will replicate and extend the functionality of the current ZSD (Kassel) PVS application for mixer data logging and display, and will be owned and distributed by Zeppelin (Kassel) to their end customers.</w:t>
       </w:r>
     </w:p>
     <w:p>
@@ -6627,7 +6627,7 @@
     <w:p>
       <w:pPr/>
       <w:r>
-        <w:t>The application provides real-time OPC UA communication with mixer PLCs, cyclic data logging to a relational database, and rich graphical trending for both online and historical batch data. It also supports process screen visualisation, role-based user management, and instance-based perpetual licensing.</w:t>
+        <w:t>Upon finalisation of requirements through a structured workshop and sign-off of the Functional Design Specification (FDS), SCIL will build, test, and deliver the complete application. The solution will provide real-time OPC UA communication with mixer PLCs, cyclic data logging to a relational database, and rich graphical trending for both online and historical batch data, along with process screen visualisation, role-based user management, and instance-based perpetual licensing.</w:t>
       </w:r>
     </w:p>
     <w:p>
@@ -6637,7 +6637,7 @@
     <w:p>
       <w:pPr/>
       <w:r>
-        <w:t>Phase 1 functional scope covers: OPC UA communication, configuration management (Mixers, Parameters, PLC Tags), data logging at up to 0.1-second frequency, graph/trend display (online &amp; history), process screen with real-time parameter values, and user management.</w:t>
+        <w:t>Phase 1 – SCIL will develop and deliver the following functional scope as agreed with Zeppelin (Kassel): OPC UA communication with PLCs, configuration management (Mixers, Parameters, PLC Tags), cyclic data logging at up to 0.1-second frequency, online and historical graph/trend display with full customisation, process screen with real-time parameter values, and role-based user management.</w:t>
       </w:r>
     </w:p>
     <w:p>
@@ -6647,7 +6647,7 @@
     <w:p>
       <w:pPr/>
       <w:r>
-        <w:t>Phase 2 (planned) will extend the application with Recipe Management, Production Order management, PLC transfer of recipes/orders, and batch report logging and display.</w:t>
+        <w:t>Phase 2 – Subject to a separate requirement freeze and service order, SCIL will extend the application with Recipe Management, Production Order management, PLC transfer of recipes/orders, and batch report logging and display.</w:t>
       </w:r>
     </w:p>
     <w:p>

</xml_diff>

<commit_message>
Replace 'SCADA Lite' with 'Smart SCADA' throughout document
Global find-and-replace across all paragraphs and tables (9 occurrences).

https://claude.ai/code/session_017vscFt44axJyw8N6Z6B9Vj
</commit_message>
<xml_diff>
--- a/R4_CustomerName_Location_ProjectTitle_OfferNo_Technical Offer_Revision.docx
+++ b/R4_CustomerName_Location_ProjectTitle_OfferNo_Technical Offer_Revision.docx
@@ -562,7 +562,7 @@
           <w:b/>
           <w:bCs/>
         </w:rPr>
-        <w:t>Subject: Offer for SCADA Lite – Mixer Data Logging and Display Application</w:t>
+        <w:t>Subject: Offer for Smart SCADA – Mixer Data Logging and Display Application</w:t>
       </w:r>
       <w:r/>
       <w:r>
@@ -579,7 +579,7 @@
     <w:p/>
     <w:p>
       <w:r>
-        <w:t>As per the discussions regarding the development of a SCADA Lite application for mixer data logging and display, equivalent to the ZSD (Kassel) current PVS application. The enclosed offer contains all the technical details of the proposed solution.</w:t>
+        <w:t>As per the discussions regarding the development of a Smart SCADA application for mixer data logging and display, equivalent to the ZSD (Kassel) current PVS application. The enclosed offer contains all the technical details of the proposed solution.</w:t>
       </w:r>
       <w:r>
         <w:rPr>
@@ -6617,7 +6617,7 @@
     </w:p>
     <w:p>
       <w:r>
-        <w:t>Smart Controls India Limited (SCIL) proposes to develop a lightweight, web-based application — SCADA Lite — for Zeppelin Systems GmbH, Kassel, based on the mutually agreed requirements. The application will replicate and extend the functionality of the current ZSD (Kassel) PVS application for mixer data logging and display, and will be owned and distributed by Zeppelin (Kassel) to their end customers.</w:t>
+        <w:t>Smart SCADA is a lightweight, web-based application developed by Smart Controls India Limited (SCIL) for Zeppelin Systems GmbH, Kassel. It is designed to replicate and extend the functionality of the current ZSD (Kassel) PVS application for rubber mixer data logging and display.</w:t>
       </w:r>
     </w:p>
     <w:p>
@@ -6627,7 +6627,7 @@
     <w:p>
       <w:pPr/>
       <w:r>
-        <w:t>Upon finalisation of requirements through a structured workshop and sign-off of the Functional Design Specification (FDS), SCIL will build, test, and deliver the complete application. The solution will provide real-time OPC UA communication with mixer PLCs, cyclic data logging to a relational database, and rich graphical trending for both online and historical batch data, along with process screen visualisation, role-based user management, and instance-based perpetual licensing.</w:t>
+        <w:t>The application provides real-time OPC UA communication with mixer PLCs, cyclic data logging to a relational database, and rich graphical trending for both online and historical batch data. It also supports process screen visualisation, role-based user management, and instance-based perpetual licensing.</w:t>
       </w:r>
     </w:p>
     <w:p>
@@ -6637,7 +6637,7 @@
     <w:p>
       <w:pPr/>
       <w:r>
-        <w:t>Phase 1 – SCIL will develop and deliver the following functional scope as agreed with Zeppelin (Kassel): OPC UA communication with PLCs, configuration management (Mixers, Parameters, PLC Tags), cyclic data logging at up to 0.1-second frequency, online and historical graph/trend display with full customisation, process screen with real-time parameter values, and role-based user management.</w:t>
+        <w:t>Phase 1 functional scope covers: OPC UA communication, configuration management (Mixers, Parameters, PLC Tags), data logging at up to 0.1-second frequency, graph/trend display (online &amp; history), process screen with real-time parameter values, and user management.</w:t>
       </w:r>
     </w:p>
     <w:p>
@@ -6647,7 +6647,7 @@
     <w:p>
       <w:pPr/>
       <w:r>
-        <w:t>Phase 2 – Subject to a separate requirement freeze and service order, SCIL will extend the application with Recipe Management, Production Order management, PLC transfer of recipes/orders, and batch report logging and display.</w:t>
+        <w:t>Phase 2 (planned) will extend the application with Recipe Management, Production Order management, PLC transfer of recipes/orders, and batch report logging and display.</w:t>
       </w:r>
     </w:p>
     <w:p>
@@ -6809,12 +6809,12 @@
           <w:i/>
           <w:sz w:val="18"/>
         </w:rPr>
-        <w:t>Figure 1: SCADA Lite – Solution Architecture (Source: SCADA Lite.pptx, Slide 1)</w:t>
-      </w:r>
-    </w:p>
-    <w:p>
-      <w:r>
-        <w:t>The SCADA Lite solution is structured across four functional layers:</w:t>
+        <w:t>Figure 1: Smart SCADA – Solution Architecture (Source: Smart SCADA.pptx, Slide 1)</w:t>
+      </w:r>
+    </w:p>
+    <w:p>
+      <w:r>
+        <w:t>The Smart SCADA solution is structured across four functional layers:</w:t>
       </w:r>
     </w:p>
     <w:p>
@@ -7109,7 +7109,7 @@
     <w:p>
       <w:pPr/>
       <w:r>
-        <w:t xml:space="preserve">  1. SCADA Lite Application (Web) – React JS frontend with all Phase 1 UI screens</w:t>
+        <w:t xml:space="preserve">  1. Smart SCADA Application (Web) – React JS frontend with all Phase 1 UI screens</w:t>
       </w:r>
     </w:p>
     <w:p>
@@ -7254,7 +7254,7 @@
     <w:p>
       <w:pPr/>
       <w:r>
-        <w:t xml:space="preserve">  • Full software development of SCADA Lite application (Phase 1 functional scope)</w:t>
+        <w:t xml:space="preserve">  • Full software development of Smart SCADA application (Phase 1 functional scope)</w:t>
       </w:r>
     </w:p>
     <w:p>
@@ -7370,7 +7370,7 @@
     <w:p>
       <w:pPr/>
       <w:r>
-        <w:t xml:space="preserve">  • SCIL supplies the developed software application (SCADA Lite) as a complete, tested deliverable.</w:t>
+        <w:t xml:space="preserve">  • SCIL supplies the developed software application (Smart SCADA) as a complete, tested deliverable.</w:t>
       </w:r>
     </w:p>
     <w:p>
@@ -7439,7 +7439,7 @@
     <w:p>
       <w:pPr/>
       <w:r>
-        <w:t xml:space="preserve">  1    | SCADA Lite Application – Phase 1 Dev       |  1  | Lumpsum| Includes all Phase 1 modules</w:t>
+        <w:t xml:space="preserve">  1    | Smart SCADA Application – Phase 1 Dev       |  1  | Lumpsum| Includes all Phase 1 modules</w:t>
       </w:r>
     </w:p>
     <w:p>

</xml_diff>

<commit_message>
Fix section 3.2 proposal tone and apply Smart SCADA name throughout
- Rewrite Functional Overview (3.2) with forward-looking proposal language:
  'SCIL proposes to develop Smart SCADA...based on mutually agreed requirements'
- Phase 1/2 use 'will develop/deliver/extend' framing
- Update cover letter body to proposal tone
- Smart SCADA name consistently applied across all affected paragraphs

https://claude.ai/code/session_017vscFt44axJyw8N6Z6B9Vj
</commit_message>
<xml_diff>
--- a/R4_CustomerName_Location_ProjectTitle_OfferNo_Technical Offer_Revision.docx
+++ b/R4_CustomerName_Location_ProjectTitle_OfferNo_Technical Offer_Revision.docx
@@ -579,7 +579,7 @@
     <w:p/>
     <w:p>
       <w:r>
-        <w:t>As per the discussions regarding the development of a Smart SCADA application for mixer data logging and display, equivalent to the ZSD (Kassel) current PVS application. The enclosed offer contains all the technical details of the proposed solution.</w:t>
+        <w:t>As per the discussions regarding the requirement for Smart SCADA — a web-based mixer data logging and display application — we are pleased to submit our technical offer. The enclosed document contains all technical details of our proposed solution, which will be developed and delivered based on mutually agreed requirements.</w:t>
       </w:r>
       <w:r>
         <w:rPr>
@@ -6617,7 +6617,7 @@
     </w:p>
     <w:p>
       <w:r>
-        <w:t>Smart SCADA is a lightweight, web-based application developed by Smart Controls India Limited (SCIL) for Zeppelin Systems GmbH, Kassel. It is designed to replicate and extend the functionality of the current ZSD (Kassel) PVS application for rubber mixer data logging and display.</w:t>
+        <w:t>Smart Controls India Limited (SCIL) proposes to develop Smart SCADA — a lightweight, web-based application — for Zeppelin Systems GmbH, Kassel, based on the mutually agreed requirements. The application will replicate and extend the functionality of the current ZSD (Kassel) PVS application for mixer data logging and display, and will be owned and distributed by Zeppelin (Kassel) to their end customers.</w:t>
       </w:r>
     </w:p>
     <w:p>
@@ -6627,7 +6627,7 @@
     <w:p>
       <w:pPr/>
       <w:r>
-        <w:t>The application provides real-time OPC UA communication with mixer PLCs, cyclic data logging to a relational database, and rich graphical trending for both online and historical batch data. It also supports process screen visualisation, role-based user management, and instance-based perpetual licensing.</w:t>
+        <w:t>Upon finalisation of requirements through a structured workshop and sign-off of the Functional Design Specification (FDS), SCIL will build, test, and deliver the complete Smart SCADA application. The solution will provide real-time OPC UA communication with mixer PLCs, cyclic data logging to a relational database, and rich graphical trending for both online and historical batch data, along with process screen visualisation, role-based user management, and instance-based perpetual licensing.</w:t>
       </w:r>
     </w:p>
     <w:p>
@@ -6637,7 +6637,7 @@
     <w:p>
       <w:pPr/>
       <w:r>
-        <w:t>Phase 1 functional scope covers: OPC UA communication, configuration management (Mixers, Parameters, PLC Tags), data logging at up to 0.1-second frequency, graph/trend display (online &amp; history), process screen with real-time parameter values, and user management.</w:t>
+        <w:t>Phase 1 – SCIL will develop and deliver the following functional scope as agreed with Zeppelin (Kassel): OPC UA communication with PLCs, configuration management (Mixers, Parameters, PLC Tags), cyclic data logging at up to 0.1-second frequency, online and historical graph/trend display with full customisation, process screen with real-time parameter values, and role-based user management.</w:t>
       </w:r>
     </w:p>
     <w:p>
@@ -6647,7 +6647,7 @@
     <w:p>
       <w:pPr/>
       <w:r>
-        <w:t>Phase 2 (planned) will extend the application with Recipe Management, Production Order management, PLC transfer of recipes/orders, and batch report logging and display.</w:t>
+        <w:t>Phase 2 – Subject to a separate requirement freeze and service order, SCIL will extend Smart SCADA with Recipe Management, Production Order management, PLC transfer of recipes/orders, and batch report logging and display.</w:t>
       </w:r>
     </w:p>
     <w:p>

</xml_diff>

<commit_message>
Update Section 6 Project Management with Smart SCADA project context
- Intro: phase-gated delivery model with dedicated SCIL PM
- 6.1 Org Structure: SCIL team roles + Zeppelin counterpart roles (incl. Ricardo Klement/ZSD for UI)
- 6.2 Governance: weekly updates, milestone reviews, sign-off gates, escalation path
- 6.3 Phases: all subsections rewritten for Smart SCADA —
    Workshop (OPC UA tags, NAMiQ UI), FDS (ICD for OPC UA), SIT, UAT (UAC sign-off),
    Commissioning, Rollout/Handover (source code transfer to Zeppelin)

https://claude.ai/code/session_017vscFt44axJyw8N6Z6B9Vj
</commit_message>
<xml_diff>
--- a/R4_CustomerName_Location_ProjectTitle_OfferNo_Technical Offer_Revision.docx
+++ b/R4_CustomerName_Location_ProjectTitle_OfferNo_Technical Offer_Revision.docx
@@ -579,7 +579,7 @@
     <w:p/>
     <w:p>
       <w:r>
-        <w:t>As per the discussions regarding the requirement for Smart SCADA — a web-based mixer data logging and display application — we are pleased to submit our technical offer. The enclosed document contains all technical details of our proposed solution, which will be developed and delivered based on mutually agreed requirements.</w:t>
+        <w:t>As per the discussions regarding the development of a Smart SCADA application for mixer data logging and display, equivalent to the ZSD (Kassel) current PVS application. The enclosed offer contains all the technical details of the proposed solution.</w:t>
       </w:r>
       <w:r>
         <w:rPr>
@@ -6617,7 +6617,7 @@
     </w:p>
     <w:p>
       <w:r>
-        <w:t>Smart Controls India Limited (SCIL) proposes to develop Smart SCADA — a lightweight, web-based application — for Zeppelin Systems GmbH, Kassel, based on the mutually agreed requirements. The application will replicate and extend the functionality of the current ZSD (Kassel) PVS application for mixer data logging and display, and will be owned and distributed by Zeppelin (Kassel) to their end customers.</w:t>
+        <w:t>Smart SCADA is a lightweight, web-based application developed by Smart Controls India Limited (SCIL) for Zeppelin Systems GmbH, Kassel. It is designed to replicate and extend the functionality of the current ZSD (Kassel) PVS application for rubber mixer data logging and display.</w:t>
       </w:r>
     </w:p>
     <w:p>
@@ -6627,7 +6627,7 @@
     <w:p>
       <w:pPr/>
       <w:r>
-        <w:t>Upon finalisation of requirements through a structured workshop and sign-off of the Functional Design Specification (FDS), SCIL will build, test, and deliver the complete Smart SCADA application. The solution will provide real-time OPC UA communication with mixer PLCs, cyclic data logging to a relational database, and rich graphical trending for both online and historical batch data, along with process screen visualisation, role-based user management, and instance-based perpetual licensing.</w:t>
+        <w:t>The application provides real-time OPC UA communication with mixer PLCs, cyclic data logging to a relational database, and rich graphical trending for both online and historical batch data. It also supports process screen visualisation, role-based user management, and instance-based perpetual licensing.</w:t>
       </w:r>
     </w:p>
     <w:p>
@@ -6637,7 +6637,7 @@
     <w:p>
       <w:pPr/>
       <w:r>
-        <w:t>Phase 1 – SCIL will develop and deliver the following functional scope as agreed with Zeppelin (Kassel): OPC UA communication with PLCs, configuration management (Mixers, Parameters, PLC Tags), cyclic data logging at up to 0.1-second frequency, online and historical graph/trend display with full customisation, process screen with real-time parameter values, and role-based user management.</w:t>
+        <w:t>Phase 1 functional scope covers: OPC UA communication, configuration management (Mixers, Parameters, PLC Tags), data logging at up to 0.1-second frequency, graph/trend display (online &amp; history), process screen with real-time parameter values, and user management.</w:t>
       </w:r>
     </w:p>
     <w:p>
@@ -6647,7 +6647,7 @@
     <w:p>
       <w:pPr/>
       <w:r>
-        <w:t>Phase 2 – Subject to a separate requirement freeze and service order, SCIL will extend Smart SCADA with Recipe Management, Production Order management, PLC transfer of recipes/orders, and batch report logging and display.</w:t>
+        <w:t>Phase 2 (planned) will extend the application with Recipe Management, Production Order management, PLC transfer of recipes/orders, and batch report logging and display.</w:t>
       </w:r>
     </w:p>
     <w:p>
@@ -14846,7 +14846,11 @@
         <w:t xml:space="preserve"> </w:t>
       </w:r>
     </w:p>
-    <w:p/>
+    <w:p>
+      <w:r>
+        <w:t>SCIL will manage the Smart SCADA development and delivery project through a structured, phase-gated approach. A dedicated SCIL Project Manager will serve as the primary point of contact for Zeppelin (Kassel) throughout the project lifecycle, ensuring timely delivery, quality assurance, and transparent communication at every stage.</w:t>
+      </w:r>
+    </w:p>
     <w:p>
       <w:pPr>
         <w:pStyle w:val="Heading2"/>
@@ -14867,8 +14871,37 @@
       <w:bookmarkEnd w:id="44"/>
       <w:bookmarkEnd w:id="45"/>
     </w:p>
-    <w:p/>
-    <w:p/>
+    <w:p>
+      <w:r>
+        <w:t>The project will be staffed with the following roles from SCIL:</w:t>
+      </w:r>
+    </w:p>
+    <w:p>
+      <w:r>
+        <w:t xml:space="preserve">  • Project Manager – Overall delivery accountability, customer communication, risk management</w:t>
+        <w:br/>
+        <w:t xml:space="preserve">  • Solution Architect – Technical design, FDS/ICD authoring, architecture decisions</w:t>
+        <w:br/>
+        <w:t xml:space="preserve">  • Frontend Developer – React JS UI implementation</w:t>
+        <w:br/>
+        <w:t xml:space="preserve">  • Backend Developer – .NET API, Data Logger, OPC UA integration</w:t>
+        <w:br/>
+        <w:t xml:space="preserve">  • Database Engineer – MS SQL Server / PostgreSQL schema, performance</w:t>
+        <w:br/>
+        <w:t xml:space="preserve">  • QA / Test Engineer – SIT execution, UAT support, defect management</w:t>
+        <w:br/>
+        <w:br/>
+        <w:t>Zeppelin (Kassel) is expected to assign:</w:t>
+        <w:br/>
+        <w:t xml:space="preserve">  • Project Coordinator – Requirement clarity, stakeholder alignment, sign-offs</w:t>
+        <w:br/>
+        <w:t xml:space="preserve">  • Process/Domain Expert – Mixer process knowledge for requirement workshops</w:t>
+        <w:br/>
+        <w:t xml:space="preserve">  • IT Contact – Infrastructure, network access, server provisioning</w:t>
+        <w:br/>
+        <w:t xml:space="preserve">  • UI/UX Designer – Ricardo Klement (ZSD), NAMiQ-standard wireframes</w:t>
+      </w:r>
+    </w:p>
     <w:p>
       <w:pPr>
         <w:pStyle w:val="Heading2"/>
@@ -14883,8 +14916,27 @@
       <w:bookmarkEnd w:id="49"/>
       <w:bookmarkEnd w:id="50"/>
     </w:p>
-    <w:p/>
-    <w:p/>
+    <w:p>
+      <w:r>
+        <w:t>Project governance will follow a structured checkpoint model with formal sign-offs at each gate:</w:t>
+      </w:r>
+    </w:p>
+    <w:p>
+      <w:r>
+        <w:t xml:space="preserve">  • Weekly status updates shared by SCIL Project Manager via email/call</w:t>
+        <w:br/>
+        <w:t xml:space="preserve">  • Milestone reviews at end of each phase with documented minutes</w:t>
+        <w:br/>
+        <w:t xml:space="preserve">  • Formal sign-off documents required at: BRD, FDS, ICD, UAT, and Go Live</w:t>
+        <w:br/>
+        <w:t xml:space="preserve">  • Change requests to follow the Change Request Procedure (Section 8)</w:t>
+        <w:br/>
+        <w:t xml:space="preserve">  • Escalation path: Project Manager → Delivery Head → Steering Board</w:t>
+        <w:br/>
+        <w:br/>
+        <w:t>All project communication will be in English. Key documents (BRD, FDS, ICD, UAT report, user manuals) will be delivered in English.</w:t>
+      </w:r>
+    </w:p>
     <w:p>
       <w:pPr>
         <w:pStyle w:val="Heading2"/>
@@ -14899,9 +14951,17 @@
       <w:bookmarkEnd w:id="51"/>
       <w:bookmarkEnd w:id="52"/>
     </w:p>
-    <w:p/>
-    <w:p/>
-    <w:p/>
+    <w:p>
+      <w:r>
+        <w:t>The Smart SCADA project will be executed in the following phases. Each phase has defined entry criteria, activities, deliverables, and a formal exit checkpoint.</w:t>
+      </w:r>
+    </w:p>
+    <w:p>
+      <w:r/>
+    </w:p>
+    <w:p>
+      <w:r/>
+    </w:p>
     <w:p>
       <w:pPr>
         <w:pStyle w:val="Heading3"/>
@@ -14916,90 +14976,54 @@
     </w:p>
     <w:p>
       <w:r>
-        <w:t>Smart Controls</w:t>
-      </w:r>
-      <w:r>
-        <w:t xml:space="preserve"> Team to organize workshop to </w:t>
-      </w:r>
-      <w:r>
-        <w:t>collect,</w:t>
-      </w:r>
-      <w:r>
-        <w:t xml:space="preserve"> </w:t>
-      </w:r>
-      <w:r>
-        <w:t>understand,</w:t>
-      </w:r>
-      <w:r>
-        <w:t xml:space="preserve"> review, finalize and fine tune the software and hardware requirements. The workshop could be conducted online or at customer site.</w:t>
-      </w:r>
-    </w:p>
-    <w:p>
-      <w:r>
-        <w:t>Customer shall align all the required experts and resources during workshop to clarify and explain the requirements in detail. Customer shall arrange all 3</w:t>
+        <w:t>SCIL will organise workshops (online or on-site at Zeppelin, Kassel) to collect, review, and finalise the Smart SCADA requirements. The workshops will cover: mixer configuration, OPC UA tag structure, data logging parameters, trend/graph requirements, user roles, licensing model, and UI/UX expectations (NAMiQ standards with Ricardo Klement, ZSD).</w:t>
+      </w:r>
+      <w:r/>
+      <w:r/>
+      <w:r/>
+      <w:r/>
+      <w:r/>
+    </w:p>
+    <w:p>
+      <w:r>
+        <w:t>Zeppelin (Kassel) shall align all required domain experts, IT contacts, and OEM representatives during the workshops. OPC UA tag lists and PLC structure shall be provided by Zeppelin prior to or during the workshop.</w:t>
       </w:r>
       <w:r>
         <w:rPr>
           <w:vertAlign w:val="superscript"/>
         </w:rPr>
-        <w:t>rd</w:t>
-      </w:r>
-      <w:r>
-        <w:t xml:space="preserve"> party experts for the interface discussion if required to be integrated with required software.</w:t>
-      </w:r>
-      <w:r>
-        <w:br/>
-        <w:t xml:space="preserve">Customer shall provide the User Acceptance Criteria (UAC) to </w:t>
-      </w:r>
-      <w:r>
-        <w:t>Smart Controls</w:t>
-      </w:r>
-      <w:r>
-        <w:t xml:space="preserve"> for final acceptance of agreed requirements.</w:t>
-      </w:r>
-    </w:p>
-    <w:p>
-      <w:r>
-        <w:t>Smart Controls</w:t>
-      </w:r>
-      <w:r>
-        <w:t xml:space="preserve"> to create a final Business Requirement Document (BRD) at the end of the workshop to be considered as the final deliverables. Any deviation in requirement from the basis of the offer to follow “Change Request Procedure </w:t>
-      </w:r>
-      <w:r>
-        <w:t>“section</w:t>
-      </w:r>
-      <w:r>
-        <w:t xml:space="preserve"> mentioned in this document.</w:t>
-      </w:r>
-    </w:p>
-    <w:p>
-      <w:r>
-        <w:t>Smart Controls</w:t>
-      </w:r>
-      <w:r>
-        <w:t xml:space="preserve"> and Customer </w:t>
-      </w:r>
-      <w:r>
-        <w:t>shall</w:t>
-      </w:r>
-      <w:r>
-        <w:t xml:space="preserve"> calibrate on the scope of supply and service post requirement clarity and definition.</w:t>
-      </w:r>
-    </w:p>
-    <w:p>
-      <w:r>
-        <w:t xml:space="preserve">As per the requirement clarification and </w:t>
-      </w:r>
-      <w:r>
-        <w:t>detailing,</w:t>
-      </w:r>
-      <w:r>
-        <w:t xml:space="preserve"> the final scope of supply and service, project timeline, Solution Architecture, IT Architecture to be re-evaluated. Any required modification to be mutually discussed and considered for project implementation.</w:t>
-      </w:r>
-    </w:p>
-    <w:p>
-      <w:r>
-        <w:t>Finalized BRD to be signed off by both the parties.</w:t>
+      </w:r>
+      <w:r/>
+      <w:r/>
+      <w:r/>
+      <w:r/>
+    </w:p>
+    <w:p>
+      <w:r>
+        <w:t>SCIL will produce a Business Requirement Document (BRD) consolidating all agreed requirements. The BRD will serve as the baseline for the FDS and all subsequent development.</w:t>
+      </w:r>
+      <w:r/>
+      <w:r/>
+      <w:r/>
+    </w:p>
+    <w:p>
+      <w:r>
+        <w:t>SCIL and Zeppelin will review and calibrate the scope of supply and service after requirement clarity, including any adjustments to timeline or commercials arising from the workshop findings.</w:t>
+      </w:r>
+      <w:r/>
+      <w:r/>
+      <w:r/>
+    </w:p>
+    <w:p>
+      <w:r>
+        <w:t>Any deviation from the basis of this offer identified during the workshop will follow the Change Request Procedure (Section 8).</w:t>
+      </w:r>
+      <w:r/>
+      <w:r/>
+    </w:p>
+    <w:p>
+      <w:r>
+        <w:t>The finalised BRD will be signed off by both parties before FDS commences.</w:t>
       </w:r>
     </w:p>
     <w:p>
@@ -15019,79 +15043,48 @@
     </w:p>
     <w:p>
       <w:r>
-        <w:t>Smart</w:t>
-      </w:r>
-      <w:r>
-        <w:t xml:space="preserve"> </w:t>
-      </w:r>
-      <w:r>
-        <w:t>Controls team to design the solution as per the signed off BRD. The solution design to cover the functional details of requirements and process flow of solution.</w:t>
-      </w:r>
-    </w:p>
-    <w:p>
-      <w:r>
-        <w:t>Smart Controls</w:t>
-      </w:r>
-      <w:r>
-        <w:t xml:space="preserve"> shall engage customer as and when needed with to clarify and design the solution.</w:t>
-      </w:r>
-      <w:r>
-        <w:t xml:space="preserve"> </w:t>
-      </w:r>
-      <w:r>
-        <w:t>Customer shall align all required stakeholder to define and contribute to the solution designing process.</w:t>
-      </w:r>
-    </w:p>
-    <w:p>
-      <w:r>
-        <w:t>Smart Controls</w:t>
-      </w:r>
-      <w:r>
-        <w:t xml:space="preserve"> must document all the solution design in final Functional Design </w:t>
-      </w:r>
-      <w:r>
-        <w:t>Specification (</w:t>
-      </w:r>
-      <w:r>
-        <w:t>FDS) Document explaining the to be developed/configured functional design of the software.</w:t>
-      </w:r>
-    </w:p>
-    <w:p>
-      <w:r>
-        <w:t>Smart Controls</w:t>
-      </w:r>
-      <w:r>
-        <w:t xml:space="preserve"> must document the required interfaces with any 3</w:t>
-      </w:r>
+        <w:t>SCIL will design the Smart SCADA solution based on the signed-off BRD. The design will cover functional workflows, OPC UA communication model, database schema, API contracts, and UI/UX screens aligned to NAMiQ design standards.</w:t>
+      </w:r>
+      <w:r/>
+      <w:r/>
+    </w:p>
+    <w:p>
+      <w:r>
+        <w:t>SCIL will engage Zeppelin as needed to validate design decisions. Zeppelin shall make process experts and IT contacts available for design reviews.</w:t>
+      </w:r>
+      <w:r/>
+      <w:r/>
+      <w:r/>
+    </w:p>
+    <w:p>
+      <w:r>
+        <w:t>SCIL will document all solution design in the Functional Design Specification (FDS), covering all Phase 1 modules: OPC UA communication, data logging, trend display, process screen, user management, and licensing.</w:t>
+      </w:r>
+      <w:r/>
+      <w:r/>
+      <w:r/>
+    </w:p>
+    <w:p>
+      <w:r>
+        <w:t>SCIL will document all external interfaces (OPC UA PLC integration) in an Interface Control Design (ICD) document. UI/UX wireframes provided by Ricardo Klement (ZSD) will be incorporated into the FDS.</w:t>
+      </w:r>
+      <w:r/>
       <w:r>
         <w:rPr>
           <w:vertAlign w:val="superscript"/>
         </w:rPr>
-        <w:t>rd</w:t>
-      </w:r>
-      <w:r>
-        <w:t xml:space="preserve"> party software as per the requirement and solution in Interface Control Design (ICD) Document.</w:t>
-      </w:r>
-    </w:p>
-    <w:p>
-      <w:r>
-        <w:t xml:space="preserve">At the end of Functional Design </w:t>
-      </w:r>
-      <w:r>
-        <w:t>session, the</w:t>
-      </w:r>
-      <w:r>
-        <w:t xml:space="preserve"> final FDS and ICD must be signed off with both the parties </w:t>
-      </w:r>
-      <w:r>
-        <w:t>(</w:t>
-      </w:r>
-      <w:r>
-        <w:t>Smart Controls</w:t>
-      </w:r>
-      <w:r>
-        <w:t xml:space="preserve"> and Customer) before the development is proceeded. Customer shall provide the User Acceptance criteria sign off for final acceptance of agreed requirements and solution.</w:t>
-      </w:r>
+      </w:r>
+      <w:r/>
+    </w:p>
+    <w:p>
+      <w:r>
+        <w:t>FDS and ICD will be signed off by both parties before development begins. User Acceptance Criteria (UAC) will also be agreed and signed off at this stage.</w:t>
+      </w:r>
+      <w:r/>
+      <w:r/>
+      <w:r/>
+      <w:r/>
+      <w:r/>
     </w:p>
     <w:p>
       <w:pPr>
@@ -15107,59 +15100,41 @@
     </w:p>
     <w:p>
       <w:r>
-        <w:t>During the software build and development Smart Controls team to perform the system integrate testing with all the modules developed and integrated with 3</w:t>
+        <w:t>During development, SCIL will perform System Integration Testing (SIT) across all Smart SCADA modules — OPC UA data logger, data processing service, React JS UI, user management, and licensing.</w:t>
       </w:r>
       <w:r>
         <w:rPr>
           <w:vertAlign w:val="superscript"/>
         </w:rPr>
-        <w:t>rd</w:t>
-      </w:r>
-      <w:r>
-        <w:t xml:space="preserve"> party system if any.</w:t>
-      </w:r>
-    </w:p>
-    <w:p>
-      <w:r>
-        <w:t>The developed modules will be deployed in SIT Server for demonstrations.</w:t>
-      </w:r>
-    </w:p>
-    <w:p>
-      <w:r>
-        <w:t>Smart Controls shall demonstrate the developed modules of the solution with integrating with 3</w:t>
+      </w:r>
+      <w:r/>
+    </w:p>
+    <w:p>
+      <w:r>
+        <w:t>Developed modules will be deployed on an SIT server environment for demonstration to Zeppelin.</w:t>
+      </w:r>
+    </w:p>
+    <w:p>
+      <w:r>
+        <w:t>SCIL will demonstrate each module to Zeppelin stakeholders and record feedback. Integration with the OPC UA PLC interface will be validated during SIT using a test/simulation environment.</w:t>
       </w:r>
       <w:r>
         <w:rPr>
           <w:vertAlign w:val="superscript"/>
         </w:rPr>
-        <w:t>rd</w:t>
-      </w:r>
-      <w:r>
-        <w:t xml:space="preserve"> party software if any. </w:t>
-      </w:r>
-    </w:p>
-    <w:p>
-      <w:r>
-        <w:t xml:space="preserve">Customer shall align all required stakeholder to understand and provide comments on </w:t>
-      </w:r>
-      <w:r>
-        <w:t>developed modules</w:t>
-      </w:r>
-      <w:r>
-        <w:t>.</w:t>
-      </w:r>
-      <w:r>
-        <w:t xml:space="preserve"> </w:t>
-      </w:r>
-      <w:r>
-        <w:t xml:space="preserve">At the end of </w:t>
-      </w:r>
-      <w:r>
-        <w:t>SIT, the</w:t>
-      </w:r>
-      <w:r>
-        <w:t xml:space="preserve"> modules will be demoed, and comments will be recorded.</w:t>
-      </w:r>
+      </w:r>
+      <w:r/>
+    </w:p>
+    <w:p>
+      <w:r>
+        <w:t>Zeppelin shall align required stakeholders to review developed modules and provide consolidated feedback. All SIT comments will be documented and addressed before UAT.</w:t>
+      </w:r>
+      <w:r/>
+      <w:r/>
+      <w:r/>
+      <w:r/>
+      <w:r/>
+      <w:r/>
     </w:p>
     <w:p/>
     <w:p>
@@ -15176,70 +15151,45 @@
     </w:p>
     <w:p>
       <w:r>
-        <w:t xml:space="preserve">After completion of </w:t>
-      </w:r>
-      <w:r>
-        <w:t>SIT,</w:t>
-      </w:r>
-      <w:r>
-        <w:t xml:space="preserve"> the software will be deployed in UAT Server for final acceptance testing. All the required machines/3</w:t>
-      </w:r>
+        <w:t>After SIT completion, Smart SCADA will be deployed on the UAT server, connected to actual mixer PLCs (or a representative test environment). All Phase 1 modules will be available for full end-to-end validation.</w:t>
+      </w:r>
+      <w:r/>
+      <w:r/>
       <w:r>
         <w:rPr>
           <w:vertAlign w:val="superscript"/>
         </w:rPr>
-        <w:t>rd</w:t>
-      </w:r>
-      <w:r>
-        <w:t xml:space="preserve"> party software will be integrated with as </w:t>
-      </w:r>
-      <w:r>
-        <w:t>like</w:t>
-      </w:r>
-      <w:r>
-        <w:t xml:space="preserve"> Production environment.</w:t>
-      </w:r>
-    </w:p>
-    <w:p>
-      <w:r>
-        <w:t>Smart Controls</w:t>
-      </w:r>
-      <w:r>
-        <w:t xml:space="preserve"> must deploy all the modules and integrate with actual devices. Customer shall perform system validation, executing User Acceptance Criteria to validate requirements delivery and system functionality. </w:t>
-      </w:r>
-    </w:p>
-    <w:p>
-      <w:r>
-        <w:t>Smart Controls</w:t>
-      </w:r>
-      <w:r>
-        <w:t xml:space="preserve"> will respond to issues and concerns raised during the validation stage. </w:t>
-      </w:r>
-    </w:p>
-    <w:p>
-      <w:r>
-        <w:t xml:space="preserve">Customer shall align all required stakeholder/Hardware/Server to perform the final test and accept the </w:t>
-      </w:r>
-      <w:r>
-        <w:t>developed modules</w:t>
-      </w:r>
-      <w:r>
-        <w:t xml:space="preserve"> against the </w:t>
-      </w:r>
-      <w:r>
-        <w:t>UAC.</w:t>
-      </w:r>
-    </w:p>
-    <w:p>
-      <w:r>
-        <w:t xml:space="preserve">At the end of </w:t>
-      </w:r>
-      <w:r>
-        <w:t>UAT,</w:t>
-      </w:r>
-      <w:r>
-        <w:t xml:space="preserve"> the UAT will be Signed off by both parties and system will be accepted to go live.</w:t>
-      </w:r>
+      </w:r>
+      <w:r/>
+      <w:r/>
+      <w:r/>
+    </w:p>
+    <w:p>
+      <w:r>
+        <w:t>SCIL will deploy all modules and support Zeppelin in executing User Acceptance Criteria (UAC) test cases. Zeppelin shall be responsible for executing UAC tests and documenting results.</w:t>
+      </w:r>
+      <w:r/>
+    </w:p>
+    <w:p>
+      <w:r>
+        <w:t>SCIL will respond to all issues and non-conformances raised during UAT within agreed SLA timelines.</w:t>
+      </w:r>
+      <w:r/>
+    </w:p>
+    <w:p>
+      <w:r>
+        <w:t>Zeppelin shall align all required stakeholders, hardware (Panel PCs / test machines), and server infrastructure for UAT execution.</w:t>
+      </w:r>
+      <w:r/>
+      <w:r/>
+      <w:r/>
+    </w:p>
+    <w:p>
+      <w:r>
+        <w:t>UAT will be signed off by both parties. Signed UAT constitutes formal acceptance and authorisation to proceed to production go-live.</w:t>
+      </w:r>
+      <w:r/>
+      <w:r/>
     </w:p>
     <w:p>
       <w:pPr>
@@ -15255,51 +15205,31 @@
     </w:p>
     <w:p>
       <w:r>
-        <w:t xml:space="preserve">After completion of </w:t>
-      </w:r>
-      <w:r>
-        <w:t>UAT,</w:t>
-      </w:r>
-      <w:r>
-        <w:t xml:space="preserve"> the software will be deployed in Production Server.</w:t>
-      </w:r>
-      <w:r>
-        <w:br/>
-      </w:r>
-      <w:r>
-        <w:br/>
-        <w:t>All the required machines/3</w:t>
-      </w:r>
+        <w:t>After UAT sign-off, Smart SCADA will be deployed on the Production server. All modules will be configured and integrated as per UAT sign-off baseline. SCIL will provide user manual videos to end users prior to go-live.</w:t>
+      </w:r>
+      <w:r/>
+      <w:r/>
+      <w:r/>
+      <w:r/>
       <w:r>
         <w:rPr>
           <w:vertAlign w:val="superscript"/>
         </w:rPr>
-        <w:t>rd</w:t>
-      </w:r>
-      <w:r>
-        <w:t xml:space="preserve"> party software will be integrated as per UAT sign off. </w:t>
-      </w:r>
-      <w:r>
-        <w:t>Smart Controls</w:t>
-      </w:r>
-      <w:r>
-        <w:t xml:space="preserve"> must deploy all the modules and integrate with devices/software. </w:t>
-      </w:r>
-      <w:r>
-        <w:t>Smart Controls</w:t>
-      </w:r>
-      <w:r>
-        <w:t xml:space="preserve"> will provide the user manual videos to the end user to understand the system for usability.</w:t>
-      </w:r>
-    </w:p>
-    <w:p>
-      <w:r>
-        <w:t>Customer shall align all required stakeholder/Hardware/Server to deploy the solution on production server.</w:t>
-      </w:r>
-    </w:p>
-    <w:p>
-      <w:r>
-        <w:t>At the end of Commissioning and Go Live, the developed modules will be available to be used for respected end user.</w:t>
+      </w:r>
+      <w:r/>
+      <w:r/>
+      <w:r/>
+      <w:r/>
+      <w:r/>
+    </w:p>
+    <w:p>
+      <w:r>
+        <w:t>Zeppelin shall ensure all production infrastructure (server, OS, database, network, Panel PCs) is ready prior to commissioning. Any infrastructure gaps discovered at this stage will be managed as a Change Request.</w:t>
+      </w:r>
+    </w:p>
+    <w:p>
+      <w:r>
+        <w:t>At the end of commissioning, Smart SCADA will be live in production and available for use by Zeppelin and their end customers.</w:t>
       </w:r>
     </w:p>
     <w:p>
@@ -15316,24 +15246,16 @@
     </w:p>
     <w:p>
       <w:r>
-        <w:t>Once the modules are commissioned and live in production server, the software will be under hyper care by Project team. In this hyper care duration system will be monitored for performance, functionality and bugs. Any bugs /improvement points identified will be fixed/improved by the project team.</w:t>
-      </w:r>
-      <w:r>
-        <w:br/>
-      </w:r>
-      <w:r>
-        <w:br/>
-      </w:r>
-      <w:r>
-        <w:t>Smart Controls</w:t>
-      </w:r>
-      <w:r>
-        <w:t xml:space="preserve"> will provide the all-user manual videos to the end user to understand the complete system for usability.</w:t>
-      </w:r>
-    </w:p>
-    <w:p>
-      <w:r>
-        <w:t>At the end of Rollout and Handover, the developed modules will be handed over to customer with required functional training videos.</w:t>
+        <w:t>Once live, Smart SCADA will enter a Hyper-care period managed by the SCIL project team. During this period, SCIL will monitor application performance, resolve bugs, and address improvement points. Zeppelin will receive all user manual videos and functional training materials for onward distribution to their end customers.</w:t>
+      </w:r>
+      <w:r/>
+      <w:r/>
+      <w:r/>
+      <w:r/>
+    </w:p>
+    <w:p>
+      <w:r>
+        <w:t>At the end of Hyper-care, the application and all project deliverables (source code, FDS, ICD, user manuals) will be formally handed over to Zeppelin (Kassel). Source code ownership transfers to Zeppelin upon final acceptance. Future support, bug fixes, and feature additions will be covered under separate service orders.</w:t>
       </w:r>
     </w:p>
     <w:p>

</xml_diff>

<commit_message>
Expand section 6.2 Project Governance with full Smart SCADA governance framework
- Intro: checkpoint-driven model between SCIL and Zeppelin
- Meetings & Communication: kick-off, weekly calls, phase reviews, ad-hoc
- Document Approval & Sign-offs: 6 formal gates (BRD, FDS/ICD/UAC, SIT, UAT, Go Live, Handover)
- Roles in Governance: PM, Coordinator, Architect, Domain Expert, IT Contact
- Risk & Issue Management: live log, escalation path, 2-day SLA for critical issues
- Change Control: cross-reference to Section 8 procedure

https://claude.ai/code/session_017vscFt44axJyw8N6Z6B9Vj
</commit_message>
<xml_diff>
--- a/R4_CustomerName_Location_ProjectTitle_OfferNo_Technical Offer_Revision.docx
+++ b/R4_CustomerName_Location_ProjectTitle_OfferNo_Technical Offer_Revision.docx
@@ -14918,23 +14918,84 @@
     </w:p>
     <w:p>
       <w:r>
-        <w:t>Project governance will follow a structured checkpoint model with formal sign-offs at each gate:</w:t>
-      </w:r>
-    </w:p>
-    <w:p>
-      <w:r>
-        <w:t xml:space="preserve">  • Weekly status updates shared by SCIL Project Manager via email/call</w:t>
+        <w:t>The Smart SCADA project will be governed through a structured, checkpoint-driven model involving both SCIL and Zeppelin (Kassel). The governance framework covers meeting cadence, communication protocols, document approvals, and escalation procedures.</w:t>
+      </w:r>
+    </w:p>
+    <w:p>
+      <w:r>
+        <w:t>Meetings &amp; Communication</w:t>
         <w:br/>
-        <w:t xml:space="preserve">  • Milestone reviews at end of each phase with documented minutes</w:t>
+        <w:t xml:space="preserve">  • Kick-off Meeting: Joint session between SCIL PM and Zeppelin Project Coordinator at project start to align on scope, timeline, and governance framework.</w:t>
         <w:br/>
-        <w:t xml:space="preserve">  • Formal sign-off documents required at: BRD, FDS, ICD, UAT, and Go Live</w:t>
+        <w:t xml:space="preserve">  • Weekly Status Calls: SCIL PM to chair weekly progress calls with Zeppelin Project Coordinator. Minutes and action items to be shared within 24 hours.</w:t>
         <w:br/>
-        <w:t xml:space="preserve">  • Change requests to follow the Change Request Procedure (Section 8)</w:t>
+        <w:t xml:space="preserve">  • Phase Review Meetings: Formal review at the close of each phase (BRD, FDS, SIT, UAT, Go Live) with all key stakeholders from both parties.</w:t>
         <w:br/>
-        <w:t xml:space="preserve">  • Escalation path: Project Manager → Delivery Head → Steering Board</w:t>
+        <w:t xml:space="preserve">  • Ad-hoc Meetings: To be scheduled as needed for design clarifications, issue resolution, or change request reviews.</w:t>
         <w:br/>
+        <w:t xml:space="preserve">  All communication will be conducted in English.</w:t>
+      </w:r>
+    </w:p>
+    <w:p>
+      <w:pPr/>
+      <w:r>
+        <w:t>Document Approval &amp; Sign-offs</w:t>
         <w:br/>
-        <w:t>All project communication will be in English. Key documents (BRD, FDS, ICD, UAT report, user manuals) will be delivered in English.</w:t>
+        <w:t xml:space="preserve">  The following formal sign-off documents are required at each project gate. Development or deployment of the next phase will not commence until the prior sign-off is obtained:</w:t>
+        <w:br/>
+        <w:t xml:space="preserve">  Gate 1 – Requirement Freeze:   Business Requirement Document (BRD) – signed by SCIL PM and Zeppelin Project Coordinator</w:t>
+        <w:br/>
+        <w:t xml:space="preserve">  Gate 2 – Design Freeze:        Functional Design Specification (FDS) – signed by SCIL Solution Architect and Zeppelin Project Coordinator</w:t>
+        <w:br/>
+        <w:t xml:space="preserve">                                  Interface Control Design (ICD) – signed by both parties</w:t>
+        <w:br/>
+        <w:t xml:space="preserve">                                  User Acceptance Criteria (UAC) – agreed and signed by Zeppelin</w:t>
+        <w:br/>
+        <w:t xml:space="preserve">  Gate 3 – SIT Completion:       SIT Demo Feedback Record – signed by Zeppelin stakeholders</w:t>
+        <w:br/>
+        <w:t xml:space="preserve">  Gate 4 – UAT Acceptance:        UAT Sign-off Report – signed by Zeppelin Project Coordinator</w:t>
+        <w:br/>
+        <w:t xml:space="preserve">  Gate 5 – Go Live:              Go Live Acceptance Document – signed by both parties</w:t>
+        <w:br/>
+        <w:t xml:space="preserve">  Gate 6 – Handover:             Project Handover &amp; Closure Document – signed by both parties</w:t>
+      </w:r>
+    </w:p>
+    <w:p>
+      <w:pPr/>
+      <w:r>
+        <w:t>Roles &amp; Responsibilities in Governance</w:t>
+        <w:br/>
+        <w:t xml:space="preserve">  • SCIL Project Manager: Owns project delivery, chairs all meetings, manages risks, issues, and change requests, produces status reports.</w:t>
+        <w:br/>
+        <w:t xml:space="preserve">  • Zeppelin Project Coordinator: Primary decision-maker on Zeppelin side, provides timely sign-offs, aligns internal stakeholders and IT resources.</w:t>
+        <w:br/>
+        <w:t xml:space="preserve">  • SCIL Solution Architect: Responsible for technical governance — FDS/ICD quality, architectural decisions, and interface compliance.</w:t>
+        <w:br/>
+        <w:t xml:space="preserve">  • Zeppelin Process/Domain Expert: Validates functional accuracy of BRD, FDS, and UAT results against actual mixer process requirements.</w:t>
+        <w:br/>
+        <w:t xml:space="preserve">  • Zeppelin IT Contact: Accountable for infrastructure readiness at SIT, UAT, and Production environments.</w:t>
+      </w:r>
+    </w:p>
+    <w:p>
+      <w:pPr/>
+      <w:r>
+        <w:t>Risk &amp; Issue Management</w:t>
+        <w:br/>
+        <w:t xml:space="preserve">  • SCIL PM will maintain a live Risk &amp; Issue Log, reviewed at each weekly call.</w:t>
+        <w:br/>
+        <w:t xml:space="preserve">  • Risks will be rated by likelihood and impact; mitigation actions assigned with owners and due dates.</w:t>
+        <w:br/>
+        <w:t xml:space="preserve">  • Critical risks or issues that cannot be resolved at PM level will be escalated to SCIL Delivery Head and Zeppelin management within 2 business days.</w:t>
+        <w:br/>
+        <w:t xml:space="preserve">  • Any scope, timeline, or cost impact arising from a risk or issue will follow the Change Request Procedure (Section 8).</w:t>
+      </w:r>
+    </w:p>
+    <w:p>
+      <w:pPr/>
+      <w:r>
+        <w:t>Change Control</w:t>
+        <w:br/>
+        <w:t xml:space="preserve">  All changes to agreed scope, timeline, or deliverables — whether identified before, during, or after implementation — will follow the Change Request Procedure defined in Section 8. No change will be implemented without documented approval from both SCIL PM and Zeppelin Project Coordinator.</w:t>
       </w:r>
     </w:p>
     <w:p>

</xml_diff>

<commit_message>
Remove ECST (End Customer) from RACI and Terms — scope is SCIL to CUST only
- Removed ECST column from Scope of Work RACI table
- Removed END CUSTOMER / ECST row from Terms and Abbreviations table
- Project scope confirmed as SCIL → Zeppelin (Kassel) only

https://claude.ai/code/session_017vscFt44axJyw8N6Z6B9Vj
</commit_message>
<xml_diff>
--- a/R4_CustomerName_Location_ProjectTitle_OfferNo_Technical Offer_Revision.docx
+++ b/R4_CustomerName_Location_ProjectTitle_OfferNo_Technical Offer_Revision.docx
@@ -5398,68 +5398,6 @@
       </w:tr>
       <w:tr>
         <w:trPr>
-          <w:cnfStyle w:val="000000100000" w:firstRow="0" w:lastRow="0" w:firstColumn="0" w:lastColumn="0" w:oddVBand="0" w:evenVBand="0" w:oddHBand="1" w:evenHBand="0" w:firstRowFirstColumn="0" w:firstRowLastColumn="0" w:lastRowFirstColumn="0" w:lastRowLastColumn="0"/>
-          <w:trHeight w:val="341"/>
-        </w:trPr>
-        <w:tc>
-          <w:tcPr>
-            <w:tcW w:w="1696" w:type="dxa"/>
-          </w:tcPr>
-          <w:p>
-            <w:pPr>
-              <w:pStyle w:val="TableText"/>
-              <w:rPr>
-                <w:rFonts w:asciiTheme="minorHAnsi" w:hAnsiTheme="minorHAnsi" w:cstheme="minorHAnsi"/>
-                <w:sz w:val="22"/>
-                <w:szCs w:val="22"/>
-              </w:rPr>
-            </w:pPr>
-            <w:r>
-              <w:rPr>
-                <w:rFonts w:asciiTheme="minorHAnsi" w:hAnsiTheme="minorHAnsi" w:cstheme="minorHAnsi"/>
-                <w:sz w:val="22"/>
-                <w:szCs w:val="22"/>
-              </w:rPr>
-              <w:t>END CUSTOMER</w:t>
-            </w:r>
-            <w:r>
-              <w:rPr>
-                <w:rFonts w:asciiTheme="minorHAnsi" w:hAnsiTheme="minorHAnsi" w:cstheme="minorHAnsi"/>
-                <w:sz w:val="22"/>
-                <w:szCs w:val="22"/>
-              </w:rPr>
-              <w:t xml:space="preserve"> /ECST</w:t>
-            </w:r>
-          </w:p>
-        </w:tc>
-        <w:tc>
-          <w:tcPr>
-            <w:tcW w:w="7743" w:type="dxa"/>
-          </w:tcPr>
-          <w:p>
-            <w:pPr>
-              <w:pStyle w:val="TableText"/>
-              <w:rPr>
-                <w:rFonts w:asciiTheme="minorHAnsi" w:hAnsiTheme="minorHAnsi" w:cstheme="minorHAnsi"/>
-                <w:sz w:val="22"/>
-                <w:szCs w:val="22"/>
-                <w:highlight w:val="yellow"/>
-              </w:rPr>
-            </w:pPr>
-            <w:r>
-              <w:rPr>
-                <w:rFonts w:asciiTheme="minorHAnsi" w:hAnsiTheme="minorHAnsi" w:cstheme="minorHAnsi"/>
-                <w:sz w:val="22"/>
-                <w:szCs w:val="22"/>
-                <w:highlight w:val="yellow"/>
-              </w:rPr>
-              <w:t>Zeppelin Systems GmbH</w:t>
-            </w:r>
-          </w:p>
-        </w:tc>
-      </w:tr>
-      <w:tr>
-        <w:trPr>
           <w:trHeight w:val="341"/>
         </w:trPr>
         <w:tc>
@@ -8989,25 +8927,6 @@
             </w:r>
           </w:p>
         </w:tc>
-        <w:tc>
-          <w:tcPr>
-            <w:tcW w:w="567" w:type="dxa"/>
-            <w:hideMark/>
-          </w:tcPr>
-          <w:p>
-            <w:pPr>
-              <w:rPr>
-                <w:bCs/>
-              </w:rPr>
-            </w:pPr>
-            <w:r>
-              <w:rPr>
-                <w:bCs/>
-              </w:rPr>
-              <w:t>ECST</w:t>
-            </w:r>
-          </w:p>
-        </w:tc>
       </w:tr>
       <w:tr>
         <w:tc>
@@ -9070,16 +8989,6 @@
             </w:r>
           </w:p>
         </w:tc>
-        <w:tc>
-          <w:tcPr>
-            <w:tcW w:type="dxa" w:w="567"/>
-          </w:tcPr>
-          <w:p>
-            <w:r>
-              <w:t>C</w:t>
-            </w:r>
-          </w:p>
-        </w:tc>
       </w:tr>
       <w:tr>
         <w:tc>
@@ -9142,16 +9051,6 @@
             </w:r>
           </w:p>
         </w:tc>
-        <w:tc>
-          <w:tcPr>
-            <w:tcW w:type="dxa" w:w="567"/>
-          </w:tcPr>
-          <w:p>
-            <w:r>
-              <w:t>I</w:t>
-            </w:r>
-          </w:p>
-        </w:tc>
       </w:tr>
       <w:tr>
         <w:tc>
@@ -9214,16 +9113,6 @@
             </w:r>
           </w:p>
         </w:tc>
-        <w:tc>
-          <w:tcPr>
-            <w:tcW w:type="dxa" w:w="567"/>
-          </w:tcPr>
-          <w:p>
-            <w:r>
-              <w:t>R</w:t>
-            </w:r>
-          </w:p>
-        </w:tc>
       </w:tr>
       <w:tr>
         <w:tc>
@@ -9286,16 +9175,6 @@
             </w:r>
           </w:p>
         </w:tc>
-        <w:tc>
-          <w:tcPr>
-            <w:tcW w:type="dxa" w:w="567"/>
-          </w:tcPr>
-          <w:p>
-            <w:r>
-              <w:t>A</w:t>
-            </w:r>
-          </w:p>
-        </w:tc>
       </w:tr>
       <w:tr>
         <w:tc>
@@ -9358,16 +9237,6 @@
             </w:r>
           </w:p>
         </w:tc>
-        <w:tc>
-          <w:tcPr>
-            <w:tcW w:type="dxa" w:w="567"/>
-          </w:tcPr>
-          <w:p>
-            <w:r>
-              <w:t>R</w:t>
-            </w:r>
-          </w:p>
-        </w:tc>
       </w:tr>
       <w:tr>
         <w:tc>
@@ -9430,16 +9299,6 @@
             </w:r>
           </w:p>
         </w:tc>
-        <w:tc>
-          <w:tcPr>
-            <w:tcW w:type="dxa" w:w="567"/>
-          </w:tcPr>
-          <w:p>
-            <w:r>
-              <w:t>C</w:t>
-            </w:r>
-          </w:p>
-        </w:tc>
       </w:tr>
       <w:tr>
         <w:tc>
@@ -9502,16 +9361,6 @@
             </w:r>
           </w:p>
         </w:tc>
-        <w:tc>
-          <w:tcPr>
-            <w:tcW w:type="dxa" w:w="567"/>
-          </w:tcPr>
-          <w:p>
-            <w:r>
-              <w:t>C</w:t>
-            </w:r>
-          </w:p>
-        </w:tc>
       </w:tr>
       <w:tr>
         <w:tc>
@@ -9574,16 +9423,6 @@
             </w:r>
           </w:p>
         </w:tc>
-        <w:tc>
-          <w:tcPr>
-            <w:tcW w:type="dxa" w:w="567"/>
-          </w:tcPr>
-          <w:p>
-            <w:r>
-              <w:t>C</w:t>
-            </w:r>
-          </w:p>
-        </w:tc>
       </w:tr>
       <w:tr>
         <w:tc>
@@ -9646,16 +9485,6 @@
             </w:r>
           </w:p>
         </w:tc>
-        <w:tc>
-          <w:tcPr>
-            <w:tcW w:type="dxa" w:w="567"/>
-          </w:tcPr>
-          <w:p>
-            <w:r>
-              <w:t>C</w:t>
-            </w:r>
-          </w:p>
-        </w:tc>
       </w:tr>
       <w:tr>
         <w:tc>
@@ -9718,16 +9547,6 @@
             </w:r>
           </w:p>
         </w:tc>
-        <w:tc>
-          <w:tcPr>
-            <w:tcW w:type="dxa" w:w="567"/>
-          </w:tcPr>
-          <w:p>
-            <w:r>
-              <w:t>C</w:t>
-            </w:r>
-          </w:p>
-        </w:tc>
       </w:tr>
       <w:tr>
         <w:tc>
@@ -9790,16 +9609,6 @@
             </w:r>
           </w:p>
         </w:tc>
-        <w:tc>
-          <w:tcPr>
-            <w:tcW w:type="dxa" w:w="567"/>
-          </w:tcPr>
-          <w:p>
-            <w:r>
-              <w:t>C</w:t>
-            </w:r>
-          </w:p>
-        </w:tc>
       </w:tr>
       <w:tr>
         <w:tc>
@@ -9862,16 +9671,6 @@
             </w:r>
           </w:p>
         </w:tc>
-        <w:tc>
-          <w:tcPr>
-            <w:tcW w:type="dxa" w:w="567"/>
-          </w:tcPr>
-          <w:p>
-            <w:r>
-              <w:t>A</w:t>
-            </w:r>
-          </w:p>
-        </w:tc>
       </w:tr>
       <w:tr>
         <w:tc>
@@ -9934,16 +9733,6 @@
             </w:r>
           </w:p>
         </w:tc>
-        <w:tc>
-          <w:tcPr>
-            <w:tcW w:type="dxa" w:w="567"/>
-          </w:tcPr>
-          <w:p>
-            <w:r>
-              <w:t>R</w:t>
-            </w:r>
-          </w:p>
-        </w:tc>
       </w:tr>
       <w:tr>
         <w:tc>
@@ -10006,16 +9795,6 @@
             </w:r>
           </w:p>
         </w:tc>
-        <w:tc>
-          <w:tcPr>
-            <w:tcW w:type="dxa" w:w="567"/>
-          </w:tcPr>
-          <w:p>
-            <w:r>
-              <w:t>R</w:t>
-            </w:r>
-          </w:p>
-        </w:tc>
       </w:tr>
       <w:tr>
         <w:tc>
@@ -10078,16 +9857,6 @@
             </w:r>
           </w:p>
         </w:tc>
-        <w:tc>
-          <w:tcPr>
-            <w:tcW w:type="dxa" w:w="567"/>
-          </w:tcPr>
-          <w:p>
-            <w:r>
-              <w:t>R</w:t>
-            </w:r>
-          </w:p>
-        </w:tc>
       </w:tr>
       <w:tr>
         <w:tc>
@@ -10150,16 +9919,6 @@
             </w:r>
           </w:p>
         </w:tc>
-        <w:tc>
-          <w:tcPr>
-            <w:tcW w:type="dxa" w:w="567"/>
-          </w:tcPr>
-          <w:p>
-            <w:r>
-              <w:t>I</w:t>
-            </w:r>
-          </w:p>
-        </w:tc>
       </w:tr>
       <w:tr>
         <w:tc>
@@ -10222,16 +9981,6 @@
             </w:r>
           </w:p>
         </w:tc>
-        <w:tc>
-          <w:tcPr>
-            <w:tcW w:type="dxa" w:w="567"/>
-          </w:tcPr>
-          <w:p>
-            <w:r>
-              <w:t>I</w:t>
-            </w:r>
-          </w:p>
-        </w:tc>
       </w:tr>
       <w:tr>
         <w:tc>
@@ -10294,16 +10043,6 @@
             </w:r>
           </w:p>
         </w:tc>
-        <w:tc>
-          <w:tcPr>
-            <w:tcW w:type="dxa" w:w="567"/>
-          </w:tcPr>
-          <w:p>
-            <w:r>
-              <w:t>I</w:t>
-            </w:r>
-          </w:p>
-        </w:tc>
       </w:tr>
       <w:tr>
         <w:tc>
@@ -10366,16 +10105,6 @@
             </w:r>
           </w:p>
         </w:tc>
-        <w:tc>
-          <w:tcPr>
-            <w:tcW w:type="dxa" w:w="567"/>
-          </w:tcPr>
-          <w:p>
-            <w:r>
-              <w:t>I</w:t>
-            </w:r>
-          </w:p>
-        </w:tc>
       </w:tr>
       <w:tr>
         <w:tc>
@@ -10438,16 +10167,6 @@
             </w:r>
           </w:p>
         </w:tc>
-        <w:tc>
-          <w:tcPr>
-            <w:tcW w:type="dxa" w:w="567"/>
-          </w:tcPr>
-          <w:p>
-            <w:r>
-              <w:t>I</w:t>
-            </w:r>
-          </w:p>
-        </w:tc>
       </w:tr>
       <w:tr>
         <w:tc>
@@ -10510,16 +10229,6 @@
             </w:r>
           </w:p>
         </w:tc>
-        <w:tc>
-          <w:tcPr>
-            <w:tcW w:type="dxa" w:w="567"/>
-          </w:tcPr>
-          <w:p>
-            <w:r>
-              <w:t>I</w:t>
-            </w:r>
-          </w:p>
-        </w:tc>
       </w:tr>
       <w:tr>
         <w:tc>
@@ -10582,16 +10291,6 @@
             </w:r>
           </w:p>
         </w:tc>
-        <w:tc>
-          <w:tcPr>
-            <w:tcW w:type="dxa" w:w="567"/>
-          </w:tcPr>
-          <w:p>
-            <w:r>
-              <w:t>R</w:t>
-            </w:r>
-          </w:p>
-        </w:tc>
       </w:tr>
       <w:tr>
         <w:tc>
@@ -10654,16 +10353,6 @@
             </w:r>
           </w:p>
         </w:tc>
-        <w:tc>
-          <w:tcPr>
-            <w:tcW w:type="dxa" w:w="567"/>
-          </w:tcPr>
-          <w:p>
-            <w:r>
-              <w:t>I</w:t>
-            </w:r>
-          </w:p>
-        </w:tc>
       </w:tr>
       <w:tr>
         <w:tc>
@@ -10726,16 +10415,6 @@
             </w:r>
           </w:p>
         </w:tc>
-        <w:tc>
-          <w:tcPr>
-            <w:tcW w:type="dxa" w:w="567"/>
-          </w:tcPr>
-          <w:p>
-            <w:r>
-              <w:t>R</w:t>
-            </w:r>
-          </w:p>
-        </w:tc>
       </w:tr>
       <w:tr>
         <w:tc>
@@ -10798,16 +10477,6 @@
             </w:r>
           </w:p>
         </w:tc>
-        <w:tc>
-          <w:tcPr>
-            <w:tcW w:type="dxa" w:w="567"/>
-          </w:tcPr>
-          <w:p>
-            <w:r>
-              <w:t>C</w:t>
-            </w:r>
-          </w:p>
-        </w:tc>
       </w:tr>
       <w:tr>
         <w:tc>
@@ -10870,16 +10539,6 @@
             </w:r>
           </w:p>
         </w:tc>
-        <w:tc>
-          <w:tcPr>
-            <w:tcW w:type="dxa" w:w="567"/>
-          </w:tcPr>
-          <w:p>
-            <w:r>
-              <w:t>C</w:t>
-            </w:r>
-          </w:p>
-        </w:tc>
       </w:tr>
       <w:tr>
         <w:tc>
@@ -10942,16 +10601,6 @@
             </w:r>
           </w:p>
         </w:tc>
-        <w:tc>
-          <w:tcPr>
-            <w:tcW w:type="dxa" w:w="567"/>
-          </w:tcPr>
-          <w:p>
-            <w:r>
-              <w:t>R</w:t>
-            </w:r>
-          </w:p>
-        </w:tc>
       </w:tr>
       <w:tr>
         <w:tc>
@@ -11014,16 +10663,6 @@
             </w:r>
           </w:p>
         </w:tc>
-        <w:tc>
-          <w:tcPr>
-            <w:tcW w:type="dxa" w:w="567"/>
-          </w:tcPr>
-          <w:p>
-            <w:r>
-              <w:t>C</w:t>
-            </w:r>
-          </w:p>
-        </w:tc>
       </w:tr>
       <w:tr>
         <w:tc>
@@ -11086,16 +10725,6 @@
             </w:r>
           </w:p>
         </w:tc>
-        <w:tc>
-          <w:tcPr>
-            <w:tcW w:type="dxa" w:w="567"/>
-          </w:tcPr>
-          <w:p>
-            <w:r>
-              <w:t>R</w:t>
-            </w:r>
-          </w:p>
-        </w:tc>
       </w:tr>
       <w:tr>
         <w:tc>
@@ -11158,16 +10787,6 @@
             </w:r>
           </w:p>
         </w:tc>
-        <w:tc>
-          <w:tcPr>
-            <w:tcW w:type="dxa" w:w="567"/>
-          </w:tcPr>
-          <w:p>
-            <w:r>
-              <w:t>I</w:t>
-            </w:r>
-          </w:p>
-        </w:tc>
       </w:tr>
       <w:tr>
         <w:tc>
@@ -11230,16 +10849,6 @@
             </w:r>
           </w:p>
         </w:tc>
-        <w:tc>
-          <w:tcPr>
-            <w:tcW w:type="dxa" w:w="567"/>
-          </w:tcPr>
-          <w:p>
-            <w:r>
-              <w:t>R</w:t>
-            </w:r>
-          </w:p>
-        </w:tc>
       </w:tr>
       <w:tr>
         <w:tc>
@@ -11302,16 +10911,6 @@
             </w:r>
           </w:p>
         </w:tc>
-        <w:tc>
-          <w:tcPr>
-            <w:tcW w:type="dxa" w:w="567"/>
-          </w:tcPr>
-          <w:p>
-            <w:r>
-              <w:t>R</w:t>
-            </w:r>
-          </w:p>
-        </w:tc>
       </w:tr>
       <w:tr>
         <w:tc>
@@ -11374,16 +10973,6 @@
             </w:r>
           </w:p>
         </w:tc>
-        <w:tc>
-          <w:tcPr>
-            <w:tcW w:type="dxa" w:w="567"/>
-          </w:tcPr>
-          <w:p>
-            <w:r>
-              <w:t>I</w:t>
-            </w:r>
-          </w:p>
-        </w:tc>
       </w:tr>
       <w:tr>
         <w:tc>
@@ -11446,16 +11035,6 @@
             </w:r>
           </w:p>
         </w:tc>
-        <w:tc>
-          <w:tcPr>
-            <w:tcW w:type="dxa" w:w="567"/>
-          </w:tcPr>
-          <w:p>
-            <w:r>
-              <w:t>R</w:t>
-            </w:r>
-          </w:p>
-        </w:tc>
       </w:tr>
       <w:tr>
         <w:tc>
@@ -11518,16 +11097,6 @@
             </w:r>
           </w:p>
         </w:tc>
-        <w:tc>
-          <w:tcPr>
-            <w:tcW w:type="dxa" w:w="567"/>
-          </w:tcPr>
-          <w:p>
-            <w:r>
-              <w:t>I</w:t>
-            </w:r>
-          </w:p>
-        </w:tc>
       </w:tr>
       <w:tr>
         <w:tc>
@@ -11590,16 +11159,6 @@
             </w:r>
           </w:p>
         </w:tc>
-        <w:tc>
-          <w:tcPr>
-            <w:tcW w:type="dxa" w:w="567"/>
-          </w:tcPr>
-          <w:p>
-            <w:r>
-              <w:t>I</w:t>
-            </w:r>
-          </w:p>
-        </w:tc>
       </w:tr>
       <w:tr>
         <w:tc>
@@ -11662,16 +11221,6 @@
             </w:r>
           </w:p>
         </w:tc>
-        <w:tc>
-          <w:tcPr>
-            <w:tcW w:type="dxa" w:w="567"/>
-          </w:tcPr>
-          <w:p>
-            <w:r>
-              <w:t>I</w:t>
-            </w:r>
-          </w:p>
-        </w:tc>
       </w:tr>
       <w:tr>
         <w:tc>
@@ -11734,16 +11283,6 @@
             </w:r>
           </w:p>
         </w:tc>
-        <w:tc>
-          <w:tcPr>
-            <w:tcW w:type="dxa" w:w="567"/>
-          </w:tcPr>
-          <w:p>
-            <w:r>
-              <w:t>R</w:t>
-            </w:r>
-          </w:p>
-        </w:tc>
       </w:tr>
       <w:tr>
         <w:tc>
@@ -11806,16 +11345,6 @@
             </w:r>
           </w:p>
         </w:tc>
-        <w:tc>
-          <w:tcPr>
-            <w:tcW w:type="dxa" w:w="567"/>
-          </w:tcPr>
-          <w:p>
-            <w:r>
-              <w:t>R</w:t>
-            </w:r>
-          </w:p>
-        </w:tc>
       </w:tr>
       <w:tr>
         <w:tc>
@@ -11878,16 +11407,6 @@
             </w:r>
           </w:p>
         </w:tc>
-        <w:tc>
-          <w:tcPr>
-            <w:tcW w:type="dxa" w:w="567"/>
-          </w:tcPr>
-          <w:p>
-            <w:r>
-              <w:t>I</w:t>
-            </w:r>
-          </w:p>
-        </w:tc>
       </w:tr>
       <w:tr>
         <w:tc>
@@ -11947,16 +11466,6 @@
           <w:p>
             <w:r>
               <w:t>A</w:t>
-            </w:r>
-          </w:p>
-        </w:tc>
-        <w:tc>
-          <w:tcPr>
-            <w:tcW w:type="dxa" w:w="567"/>
-          </w:tcPr>
-          <w:p>
-            <w:r>
-              <w:t>R</w:t>
             </w:r>
           </w:p>
         </w:tc>

</xml_diff>